<commit_message>
EGCH: the decree's exemption threshold is now a registered fact, so the study's own prose gate can see it
Citing decree 258 put "34.2% nitrogen" into the delivered study and the workbook, and
prose_check reported both as unreconciled — correctly, because a figure in delivered text
has to exist as a number this study holds. Registering it was not enough: the pool counts
only inputs a BUILDER CONSUMES, which is the right design, so the number had to come out
of the register rather than sit typed beside it. Both places now format it from
an_exempt_n_pct. 471 prose figures, 0 unmatched.

The fact itself is consumed by no calculation and says so in its own source string: the
duty is charged on the urea export leg and urea is not exempt.

recalc 641 of 641 formula cells, footing 51 tables clean.

Co-Authored-By: Claude Opus 5 <noreply@anthropic.com>
Claude-Session: https://claude.ai/code/session_017RcjXG4ETjADcoFJf123yY
</commit_message>
<xml_diff>
--- a/engine/egch_study/EGCH_Bibliography_05-09-2026.docx
+++ b/engine/egch_study/EGCH_Bibliography_05-09-2026.docx
@@ -22673,7 +22673,7 @@
           <w:color w:val="1C3A36"/>
           <w:sz w:val="21"/>
         </w:rPr>
-        <w:t>L3 — Official external (regulator, central bank, government)  (11 inputs)</w:t>
+        <w:t>L3 — Official external (regulator, central bank, government)  (13 inputs)</w:t>
       </w:r>
     </w:p>
     <w:tbl>
@@ -22822,7 +22822,7 @@
                 <w:color w:val="1C3A36"/>
                 <w:sz w:val="14"/>
               </w:rPr>
-              <w:t>cbe_inflation_target</w:t>
+              <w:t>an_exempt_n_pct</w:t>
             </w:r>
           </w:p>
         </w:tc>
@@ -22840,7 +22840,7 @@
                 <w:color w:val="1C3A36"/>
                 <w:sz w:val="14"/>
               </w:rPr>
-              <w:t>0.07</w:t>
+              <w:t>0.342</w:t>
             </w:r>
           </w:p>
         </w:tc>
@@ -22876,7 +22876,7 @@
                 <w:color w:val="1C3A36"/>
                 <w:sz w:val="14"/>
               </w:rPr>
-              <w:t>2026-07-09</w:t>
+              <w:t>2026-06-25</w:t>
             </w:r>
           </w:p>
         </w:tc>
@@ -22894,7 +22894,7 @@
                 <w:color w:val="1C3A36"/>
                 <w:sz w:val="14"/>
               </w:rPr>
-              <w:t>Central bank published medium-term inflation target (7% +/-2 for Q4 2026)</w:t>
+              <w:t>Decree No. 258 of 2026, exemption clause — pure ammonium nitrate whose nitrogen content EXCEEDS 34.2% is outside the 10% export duty, verified by joint Customs Authority and export-control sampling of the shipment. Free-zone shipments to productive enterprises are likewise exempt. A fact about the instrument, consumed by no calculation in this study: the duty is charged on the urea export leg, and urea is not exempt</w:t>
             </w:r>
           </w:p>
         </w:tc>
@@ -22914,6 +22914,98 @@
                 <w:color w:val="1C3A36"/>
                 <w:sz w:val="14"/>
               </w:rPr>
+              <w:t>cbe_inflation_target</w:t>
+            </w:r>
+          </w:p>
+        </w:tc>
+        <w:tc>
+          <w:tcPr>
+            <w:tcW w:type="dxa" w:w="1944"/>
+          </w:tcPr>
+          <w:p>
+            <w:pPr>
+              <w:spacing w:after="20"/>
+              <w:jc w:val="left"/>
+            </w:pPr>
+            <w:r>
+              <w:rPr>
+                <w:color w:val="1C3A36"/>
+                <w:sz w:val="14"/>
+              </w:rPr>
+              <w:t>0.07</w:t>
+            </w:r>
+          </w:p>
+        </w:tc>
+        <w:tc>
+          <w:tcPr>
+            <w:tcW w:type="dxa" w:w="1224"/>
+          </w:tcPr>
+          <w:p>
+            <w:pPr>
+              <w:spacing w:after="20"/>
+              <w:jc w:val="left"/>
+            </w:pPr>
+            <w:r>
+              <w:rPr>
+                <w:color w:val="1C3A36"/>
+                <w:sz w:val="14"/>
+              </w:rPr>
+              <w:t>ratio</w:t>
+            </w:r>
+          </w:p>
+        </w:tc>
+        <w:tc>
+          <w:tcPr>
+            <w:tcW w:type="dxa" w:w="1152"/>
+          </w:tcPr>
+          <w:p>
+            <w:pPr>
+              <w:spacing w:after="20"/>
+              <w:jc w:val="left"/>
+            </w:pPr>
+            <w:r>
+              <w:rPr>
+                <w:color w:val="1C3A36"/>
+                <w:sz w:val="14"/>
+              </w:rPr>
+              <w:t>2026-07-09</w:t>
+            </w:r>
+          </w:p>
+        </w:tc>
+        <w:tc>
+          <w:tcPr>
+            <w:tcW w:type="dxa" w:w="7344"/>
+          </w:tcPr>
+          <w:p>
+            <w:pPr>
+              <w:spacing w:after="20"/>
+              <w:jc w:val="left"/>
+            </w:pPr>
+            <w:r>
+              <w:rPr>
+                <w:color w:val="1C3A36"/>
+                <w:sz w:val="14"/>
+              </w:rPr>
+              <w:t>Central bank published medium-term inflation target (7% +/-2 for Q4 2026)</w:t>
+            </w:r>
+          </w:p>
+        </w:tc>
+      </w:tr>
+      <w:tr>
+        <w:tc>
+          <w:tcPr>
+            <w:tcW w:type="dxa" w:w="2448"/>
+          </w:tcPr>
+          <w:p>
+            <w:pPr>
+              <w:spacing w:after="20"/>
+              <w:jc w:val="left"/>
+            </w:pPr>
+            <w:r>
+              <w:rPr>
+                <w:color w:val="1C3A36"/>
+                <w:sz w:val="14"/>
+              </w:rPr>
               <w:t>cpi_latest</w:t>
             </w:r>
           </w:p>
@@ -22987,6 +23079,98 @@
                 <w:sz w:val="14"/>
               </w:rPr>
               <w:t>Egyptian headline urban consumer price inflation, official statistics</w:t>
+            </w:r>
+          </w:p>
+        </w:tc>
+      </w:tr>
+      <w:tr>
+        <w:tc>
+          <w:tcPr>
+            <w:tcW w:type="dxa" w:w="2448"/>
+          </w:tcPr>
+          <w:p>
+            <w:pPr>
+              <w:spacing w:after="20"/>
+              <w:jc w:val="left"/>
+            </w:pPr>
+            <w:r>
+              <w:rPr>
+                <w:color w:val="1C3A36"/>
+                <w:sz w:val="14"/>
+              </w:rPr>
+              <w:t>export_duty_2026</w:t>
+            </w:r>
+          </w:p>
+        </w:tc>
+        <w:tc>
+          <w:tcPr>
+            <w:tcW w:type="dxa" w:w="1944"/>
+          </w:tcPr>
+          <w:p>
+            <w:pPr>
+              <w:spacing w:after="20"/>
+              <w:jc w:val="left"/>
+            </w:pPr>
+            <w:r>
+              <w:rPr>
+                <w:color w:val="1C3A36"/>
+                <w:sz w:val="14"/>
+              </w:rPr>
+              <w:t>0.1</w:t>
+            </w:r>
+          </w:p>
+        </w:tc>
+        <w:tc>
+          <w:tcPr>
+            <w:tcW w:type="dxa" w:w="1224"/>
+          </w:tcPr>
+          <w:p>
+            <w:pPr>
+              <w:spacing w:after="20"/>
+              <w:jc w:val="left"/>
+            </w:pPr>
+            <w:r>
+              <w:rPr>
+                <w:color w:val="1C3A36"/>
+                <w:sz w:val="14"/>
+              </w:rPr>
+              <w:t>ratio</w:t>
+            </w:r>
+          </w:p>
+        </w:tc>
+        <w:tc>
+          <w:tcPr>
+            <w:tcW w:type="dxa" w:w="1152"/>
+          </w:tcPr>
+          <w:p>
+            <w:pPr>
+              <w:spacing w:after="20"/>
+              <w:jc w:val="left"/>
+            </w:pPr>
+            <w:r>
+              <w:rPr>
+                <w:color w:val="1C3A36"/>
+                <w:sz w:val="14"/>
+              </w:rPr>
+              <w:t>2026-06-25</w:t>
+            </w:r>
+          </w:p>
+        </w:tc>
+        <w:tc>
+          <w:tcPr>
+            <w:tcW w:type="dxa" w:w="7344"/>
+          </w:tcPr>
+          <w:p>
+            <w:pPr>
+              <w:spacing w:after="20"/>
+              <w:jc w:val="left"/>
+            </w:pPr>
+            <w:r>
+              <w:rPr>
+                <w:color w:val="1C3A36"/>
+                <w:sz w:val="14"/>
+              </w:rPr>
+              <w:t>Decree No. 258 of 2026 of the Minister of Investment and Foreign Trade, published in the Official Gazette on 25 June 2026 — 10% ad valorem on the FOB invoice value of nitrogen fertiliser exports, the invoice certified by the Chamber of Chemical Industries. It replaced a temporary US$90/t duty imposed in May 2026 for three months; the 10% carries no stated expiry. Pure ammonium nitrate above 34.2% nitrogen and free zone shipments are exempt — urea is neither. Read from two independent reports of the instrument rather than the Gazette text, which is the remaining gap in this citation</w:t>
             </w:r>
           </w:p>
         </w:tc>
@@ -23836,7 +24020,7 @@
           <w:color w:val="1C3A36"/>
           <w:sz w:val="21"/>
         </w:rPr>
-        <w:t>L4 — Industry and sector context  (24 inputs)</w:t>
+        <w:t>L4 — Industry and sector context  (23 inputs)</w:t>
       </w:r>
     </w:p>
     <w:tbl>
@@ -24794,98 +24978,6 @@
                 <w:sz w:val="14"/>
               </w:rPr>
               <w:t>The credit-default-swap equity risk premium this study carried BEFORE the correction of 9 August 2026, reconstructed at the time from a sovereign spread the source file does not carry. Registered as the historical fact it is so the correction note beside it is computed rather than typed.</w:t>
-            </w:r>
-          </w:p>
-        </w:tc>
-      </w:tr>
-      <w:tr>
-        <w:tc>
-          <w:tcPr>
-            <w:tcW w:type="dxa" w:w="2448"/>
-          </w:tcPr>
-          <w:p>
-            <w:pPr>
-              <w:spacing w:after="20"/>
-              <w:jc w:val="left"/>
-            </w:pPr>
-            <w:r>
-              <w:rPr>
-                <w:color w:val="1C3A36"/>
-                <w:sz w:val="14"/>
-              </w:rPr>
-              <w:t>export_duty_2026</w:t>
-            </w:r>
-          </w:p>
-        </w:tc>
-        <w:tc>
-          <w:tcPr>
-            <w:tcW w:type="dxa" w:w="1944"/>
-          </w:tcPr>
-          <w:p>
-            <w:pPr>
-              <w:spacing w:after="20"/>
-              <w:jc w:val="left"/>
-            </w:pPr>
-            <w:r>
-              <w:rPr>
-                <w:color w:val="1C3A36"/>
-                <w:sz w:val="14"/>
-              </w:rPr>
-              <w:t>0.1</w:t>
-            </w:r>
-          </w:p>
-        </w:tc>
-        <w:tc>
-          <w:tcPr>
-            <w:tcW w:type="dxa" w:w="1224"/>
-          </w:tcPr>
-          <w:p>
-            <w:pPr>
-              <w:spacing w:after="20"/>
-              <w:jc w:val="left"/>
-            </w:pPr>
-            <w:r>
-              <w:rPr>
-                <w:color w:val="1C3A36"/>
-                <w:sz w:val="14"/>
-              </w:rPr>
-              <w:t>ratio</w:t>
-            </w:r>
-          </w:p>
-        </w:tc>
-        <w:tc>
-          <w:tcPr>
-            <w:tcW w:type="dxa" w:w="1152"/>
-          </w:tcPr>
-          <w:p>
-            <w:pPr>
-              <w:spacing w:after="20"/>
-              <w:jc w:val="left"/>
-            </w:pPr>
-            <w:r>
-              <w:rPr>
-                <w:color w:val="1C3A36"/>
-                <w:sz w:val="14"/>
-              </w:rPr>
-              <w:t>2026-01-01</w:t>
-            </w:r>
-          </w:p>
-        </w:tc>
-        <w:tc>
-          <w:tcPr>
-            <w:tcW w:type="dxa" w:w="7344"/>
-          </w:tcPr>
-          <w:p>
-            <w:pPr>
-              <w:spacing w:after="20"/>
-              <w:jc w:val="left"/>
-            </w:pPr>
-            <w:r>
-              <w:rPr>
-                <w:color w:val="1C3A36"/>
-                <w:sz w:val="14"/>
-              </w:rPr>
-              <w:t>2026 replacement of the shortfall levy with an ad-valorem duty tied to the global price. NO DECREE, MINISTRY OR RATE DOCUMENT HAS BEEN LOCATED: this rests on press reporting (Mada Masr, Edge Consultancy) as this study's own sweep register states, not on an official instrument, and it is tiered L4 for that reason while the three policy inputs above cite their decisions by number</w:t>
             </w:r>
           </w:p>
         </w:tc>

</xml_diff>